<commit_message>
fix(templates): the service contract rests fire safety on Legea 307/2006 art. 12 alin. (3), the contracted technician, and not alin. (1) and (2), which oblige an operator to employ one
The rebuild with the current build tools also keeps each article that ends in a colon with the list after it, as every other template already does.
</commit_message>
<xml_diff>
--- a/packages/document-engine/templates/other/service_contract.docx
+++ b/packages/document-engine/templates/other/service_contract.docx
@@ -96,7 +96,7 @@
     <w:p>
       <w:pPr>
         <w:pStyle w:val="Normal"/>
-        <w:keepNext w:val="false"/>
+        <w:keepNext/>
         <w:numPr>
           <w:ilvl w:val="0"/>
           <w:numId w:val="1"/>
@@ -321,7 +321,7 @@
           <w:sz w:val="20"/>
           <w:lang w:val="ro-RO"/>
         </w:rPr>
-        <w:t xml:space="preserve">Contractul se încheie în temeiul Legii 319/2006 – art. 8 alin. (4), privind recurgerea la servicii externe de prevenire și protecție, și al Normelor metodologice de aplicare a acesteia, aprobate prin H.G. 1425/2006.</w:t>
+        <w:t>Contractul se încheie în temeiul Legii 319/2006 – art. 8 alin. (4), privind recurgerea la servicii externe de prevenire și protecție, și al Normelor metodologice de aplicare a acesteia, aprobate prin H.G. 1425/2006.</w:t>
       </w:r>
     </w:p>
     <w:p>
@@ -420,7 +420,7 @@
           <w:sz w:val="20"/>
           <w:lang w:val="ro-RO"/>
         </w:rPr>
-        <w:t xml:space="preserve">Prestatorul este serviciu extern de prevenire și protecție în sensul Legii 319/2006 – art. 5 lit. p), și își desfășoară activitatea în baza Certificatului de abilitare nr. {{provider.authorization.number}} din {{provider.authorization.date}}, emis de {{provider.authorization.issuer}}, a cărui copie este anexată prezentului contract.</w:t>
+        <w:t>Prestatorul este serviciu extern de prevenire și protecție în sensul Legii 319/2006 – art. 5 lit. p), și își desfășoară activitatea în baza Certificatului de abilitare nr. {{provider.authorization.number}} din {{provider.authorization.date}}, emis de {{provider.authorization.issuer}}, a cărui copie este anexată prezentului contract.</w:t>
       </w:r>
     </w:p>
     <w:p>
@@ -519,7 +519,7 @@
           <w:sz w:val="20"/>
           <w:lang w:val="ro-RO"/>
         </w:rPr>
-        <w:t xml:space="preserve">În domeniul apărării împotriva incendiilor, contractul se încheie în temeiul Legii 307/2006 privind apărarea împotriva incendiilor, art. 12 alin. (1) și (2) și art. 27, al Normelor generale de apărare împotriva incendiilor, aprobate prin OMAI 163/2007 – art. 6 alin. (2), și al OMAI 106/2007 privind criteriile de stabilire a consiliilor locale și operatorilor economici care au obligația de a angaja cel puțin un cadru tehnic sau personal de specialitate cu atribuții în domeniul apărării împotriva incendiilor.</w:t>
+        <w:t>În domeniul apărării împotriva incendiilor, contractul se încheie în temeiul Legii 307/2006 privind apărarea împotriva incendiilor, art. 12 alin. (3) și art. 27, al Normelor generale de apărare împotriva incendiilor, aprobate prin OMAI 163/2007 – art. 6 alin. (2), și al OMAI 106/2007 privind criteriile de stabilire a consiliilor locale și operatorilor economici care au obligația de a angaja cel puțin un cadru tehnic sau personal de specialitate cu atribuții în domeniul apărării împotriva incendiilor.</w:t>
       </w:r>
     </w:p>
     <w:p>
@@ -750,13 +750,13 @@
           <w:sz w:val="20"/>
           <w:lang w:val="ro-RO"/>
         </w:rPr>
-        <w:t xml:space="preserve">Prestatorul desfășoară pentru beneficiar activitățile de prevenire și protecție prevăzute de H.G. 1425/2006 – art. 15 alin. (1), în limitele stabilite de prezentul contract.</w:t>
-      </w:r>
-    </w:p>
-    <w:p>
-      <w:pPr>
-        <w:pStyle w:val="Normal"/>
-        <w:keepNext w:val="false"/>
+        <w:t>Prestatorul desfășoară pentru beneficiar activitățile de prevenire și protecție prevăzute de H.G. 1425/2006 – art. 15 alin. (1), în limitele stabilite de prezentul contract.</w:t>
+      </w:r>
+    </w:p>
+    <w:p>
+      <w:pPr>
+        <w:pStyle w:val="Normal"/>
+        <w:keepNext/>
         <w:numPr>
           <w:ilvl w:val="0"/>
           <w:numId w:val="1"/>
@@ -816,7 +816,7 @@
           <w:sz w:val="20"/>
           <w:lang w:val="ro-RO"/>
         </w:rPr>
-        <w:t xml:space="preserve">a) identifică pericolele și evaluează riscurile pentru fiecare componentă a sistemului de muncă (executant, sarcină de muncă, mijloace de muncă și mediu de muncă), pe locuri de muncă și posturi de lucru (H.G. 1425/2006 – art. 15 alin. (1) pct. 1);</w:t>
+        <w:t>a) identifică pericolele și evaluează riscurile pentru fiecare componentă a sistemului de muncă (executant, sarcină de muncă, mijloace de muncă și mediu de muncă), pe locuri de muncă și posturi de lucru (H.G. 1425/2006 – art. 15 alin. (1) pct. 1);</w:t>
       </w:r>
     </w:p>
     <w:p>
@@ -1047,7 +1047,7 @@
           <w:sz w:val="20"/>
           <w:lang w:val="ro-RO"/>
         </w:rPr>
-        <w:t xml:space="preserve">h) identifică echipamentele individuale de protecție necesare pentru posturile de lucru și întocmește necesarul de dotare a lucrătorilor, conform H.G. 1048/2006 (pct. 20);</w:t>
+        <w:t>h) identifică echipamentele individuale de protecție necesare pentru posturile de lucru și întocmește necesarul de dotare a lucrătorilor, conform H.G. 1048/2006 (pct. 20);</w:t>
       </w:r>
     </w:p>
     <w:p>
@@ -1245,7 +1245,7 @@
           <w:sz w:val="20"/>
           <w:lang w:val="ro-RO"/>
         </w:rPr>
-        <w:t xml:space="preserve">n) participă la cercetarea evenimentelor, potrivit competențelor prevăzute de H.G. 1425/2006 – art. 108–177 (pct. 22);</w:t>
+        <w:t>n) participă la cercetarea evenimentelor, potrivit competențelor prevăzute de H.G. 1425/2006 – art. 108–177 (pct. 22);</w:t>
       </w:r>
     </w:p>
     <w:p>
@@ -1581,7 +1581,7 @@
     <w:p>
       <w:pPr>
         <w:pStyle w:val="Normal"/>
-        <w:keepNext w:val="false"/>
+        <w:keepNext/>
         <w:numPr>
           <w:ilvl w:val="0"/>
           <w:numId w:val="1"/>
@@ -2076,7 +2076,7 @@
     <w:p>
       <w:pPr>
         <w:pStyle w:val="Normal"/>
-        <w:keepNext w:val="false"/>
+        <w:keepNext/>
         <w:numPr>
           <w:ilvl w:val="0"/>
           <w:numId w:val="1"/>
@@ -2571,7 +2571,7 @@
     <w:p>
       <w:pPr>
         <w:pStyle w:val="Normal"/>
-        <w:keepNext w:val="false"/>
+        <w:keepNext/>
         <w:numPr>
           <w:ilvl w:val="0"/>
           <w:numId w:val="1"/>
@@ -2802,7 +2802,7 @@
     <w:p>
       <w:pPr>
         <w:pStyle w:val="Normal"/>
-        <w:keepNext w:val="false"/>
+        <w:keepNext/>
         <w:numPr>
           <w:ilvl w:val="0"/>
           <w:numId w:val="1"/>
@@ -3588,7 +3588,7 @@
           <w:sz w:val="20"/>
           <w:lang w:val="ro-RO"/>
         </w:rPr>
-        <w:t xml:space="preserve">Beneficiarul răspunde, potrivit legii, pentru asigurarea securității și sănătății lucrătorilor în toate aspectele legate de muncă. Încheierea prezentului contract nu îl exonerează de această răspundere (Legea 319/2006 – art. 6 alin. (2)).</w:t>
+        <w:t>Beneficiarul răspunde, potrivit legii, pentru asigurarea securității și sănătății lucrătorilor în toate aspectele legate de muncă. Încheierea prezentului contract nu îl exonerează de această răspundere (Legea 319/2006 – art. 6 alin. (2)).</w:t>
       </w:r>
     </w:p>
     <w:p>
@@ -4471,13 +4471,14 @@
       <w:pStyle w:val="Footer"/>
       <w:bidi w:val="0"/>
       <w:spacing w:before="60" w:after="0"/>
-      <w:ind w:hanging="0" w:left="0"/>
+      <w:ind w:hanging="0" w:left="0" w:right="0"/>
       <w:jc w:val="center"/>
       <w:rPr>
         <w:rFonts w:ascii="Arial" w:hAnsi="Arial"/>
         <w:b w:val="false"/>
         <w:color w:val="7A7A7A"/>
         <w:sz w:val="15"/>
+        <w:szCs w:val="15"/>
         <w:lang w:val="ro-RO"/>
       </w:rPr>
     </w:pPr>
@@ -4487,6 +4488,7 @@
         <w:b w:val="false"/>
         <w:color w:val="7A7A7A"/>
         <w:sz w:val="15"/>
+        <w:szCs w:val="15"/>
         <w:lang w:val="ro-RO"/>
       </w:rPr>
       <w:t>{{#branding}}Document generat cu SSM Ușor · ssmusor.ro{{/branding}}</w:t>

</xml_diff>